<commit_message>
Actualizo documento del proyecto store sales
</commit_message>
<xml_diff>
--- a/docs/Store_Sales_Informe.docx
+++ b/docs/Store_Sales_Informe.docx
@@ -3,10 +3,734 @@
 <w:document xmlns:wpc="http://schemas.microsoft.com/office/word/2010/wordprocessingCanvas" xmlns:cx="http://schemas.microsoft.com/office/drawing/2014/chartex" xmlns:cx1="http://schemas.microsoft.com/office/drawing/2015/9/8/chartex" xmlns:cx2="http://schemas.microsoft.com/office/drawing/2015/10/21/chartex" xmlns:cx3="http://schemas.microsoft.com/office/drawing/2016/5/9/chartex" xmlns:cx4="http://schemas.microsoft.com/office/drawing/2016/5/10/chartex" xmlns:cx5="http://schemas.microsoft.com/office/drawing/2016/5/11/chartex" xmlns:cx6="http://schemas.microsoft.com/office/drawing/2016/5/12/chartex" xmlns:cx7="http://schemas.microsoft.com/office/drawing/2016/5/13/chartex" xmlns:cx8="http://schemas.microsoft.com/office/drawing/2016/5/14/chartex" xmlns:mc="http://schemas.openxmlformats.org/markup-compatibility/2006" xmlns:aink="http://schemas.microsoft.com/office/drawing/2016/ink" xmlns:am3d="http://schemas.microsoft.com/office/drawing/2017/model3d" xmlns:o="urn:schemas-microsoft-com:office:office" xmlns:oel="http://schemas.microsoft.com/office/2019/extlst" xmlns:r="http://schemas.openxmlformats.org/officeDocument/2006/relationships" xmlns:m="http://schemas.openxmlformats.org/officeDocument/2006/math" xmlns:v="urn:schemas-microsoft-com:vml" xmlns:wp14="http://schemas.microsoft.com/office/word/2010/wordprocessingDrawing" xmlns:wp="http://schemas.openxmlformats.org/drawingml/2006/wordprocessingDrawing" xmlns:w10="urn:schemas-microsoft-com:office:word" xmlns:w="http://schemas.openxmlformats.org/wordprocessingml/2006/main" xmlns:w14="http://schemas.microsoft.com/office/word/2010/wordml" xmlns:w15="http://schemas.microsoft.com/office/word/2012/wordml" xmlns:w16cex="http://schemas.microsoft.com/office/word/2018/wordml/cex" xmlns:w16cid="http://schemas.microsoft.com/office/word/2016/wordml/cid" xmlns:w16="http://schemas.microsoft.com/office/word/2018/wordml" xmlns:w16du="http://schemas.microsoft.com/office/word/2023/wordml/word16du" xmlns:w16sdtdh="http://schemas.microsoft.com/office/word/2020/wordml/sdtdatahash" xmlns:w16sdtfl="http://schemas.microsoft.com/office/word/2024/wordml/sdtformatlock" xmlns:w16se="http://schemas.microsoft.com/office/word/2015/wordml/symex" xmlns:wpg="http://schemas.microsoft.com/office/word/2010/wordprocessingGroup" xmlns:wpi="http://schemas.microsoft.com/office/word/2010/wordprocessingInk" xmlns:wne="http://schemas.microsoft.com/office/word/2006/wordml" xmlns:wps="http://schemas.microsoft.com/office/word/2010/wordprocessingShape" mc:Ignorable="w14 w15 w16se w16cid w16 w16cex w16sdtdh w16sdtfl w16du wp14">
   <w:body>
     <w:p>
-      <w:r>
-        <w:t>Proyecto Store Sales</w:t>
-      </w:r>
-    </w:p>
+      <w:pPr>
+        <w:rPr>
+          <w:b/>
+          <w:bCs/>
+        </w:rPr>
+      </w:pPr>
+      <w:r>
+        <w:rPr>
+          <w:b/>
+          <w:bCs/>
+        </w:rPr>
+        <w:t>Proyecto: Store Sales</w:t>
+      </w:r>
+    </w:p>
+    <w:p>
+      <w:pPr>
+        <w:rPr>
+          <w:b/>
+          <w:bCs/>
+        </w:rPr>
+      </w:pPr>
+      <w:r>
+        <w:rPr>
+          <w:b/>
+          <w:bCs/>
+        </w:rPr>
+        <w:t>Hipótesis</w:t>
+      </w:r>
+    </w:p>
+    <w:p>
+      <w:pPr>
+        <w:rPr>
+          <w:b/>
+          <w:bCs/>
+        </w:rPr>
+      </w:pPr>
+      <w:r>
+        <w:rPr>
+          <w:b/>
+          <w:bCs/>
+        </w:rPr>
+        <w:t>¿El número de ventas es mayor durante los fines de semana?</w:t>
+      </w:r>
+    </w:p>
+    <w:p>
+      <w:pPr>
+        <w:rPr>
+          <w:b/>
+          <w:bCs/>
+        </w:rPr>
+      </w:pPr>
+      <w:r>
+        <w:rPr>
+          <w:b/>
+          <w:bCs/>
+        </w:rPr>
+        <w:t>Según el tipo de tienda ¿Hay tiendas que venden más que otras?</w:t>
+      </w:r>
+    </w:p>
+    <w:p>
+      <w:pPr>
+        <w:rPr>
+          <w:b/>
+          <w:bCs/>
+        </w:rPr>
+      </w:pPr>
+      <w:r>
+        <w:rPr>
+          <w:b/>
+          <w:bCs/>
+        </w:rPr>
+        <w:t>Según el tipo de tienda ¿Funcionan mejor las promociones en un tipo de tiendas respecto a las otras?</w:t>
+      </w:r>
+    </w:p>
+    <w:p>
+      <w:pPr>
+        <w:rPr>
+          <w:b/>
+          <w:bCs/>
+        </w:rPr>
+      </w:pPr>
+      <w:r>
+        <w:rPr>
+          <w:b/>
+          <w:bCs/>
+        </w:rPr>
+        <w:t>¿Cómo afecta el precio de la gasolina a las ventas?</w:t>
+      </w:r>
+    </w:p>
+    <w:p>
+      <w:pPr>
+        <w:rPr>
+          <w:b/>
+          <w:bCs/>
+        </w:rPr>
+      </w:pPr>
+    </w:p>
+    <w:p>
+      <w:pPr>
+        <w:rPr>
+          <w:b/>
+          <w:bCs/>
+        </w:rPr>
+      </w:pPr>
+      <w:r>
+        <w:rPr>
+          <w:b/>
+          <w:bCs/>
+        </w:rPr>
+        <w:pict w14:anchorId="37A0A3FF">
+          <v:rect id="_x0000_i1031" style="width:0;height:1.5pt" o:hralign="center" o:hrstd="t" o:hr="t" fillcolor="#a0a0a0" stroked="f"/>
+        </w:pict>
+      </w:r>
+    </w:p>
+    <w:p>
+      <w:pPr>
+        <w:rPr>
+          <w:b/>
+          <w:bCs/>
+        </w:rPr>
+      </w:pPr>
+      <w:r>
+        <w:rPr>
+          <w:b/>
+          <w:bCs/>
+        </w:rPr>
+        <w:t>Diccionario de Datos</w:t>
+      </w:r>
+    </w:p>
+    <w:p>
+      <w:pPr>
+        <w:rPr>
+          <w:b/>
+          <w:bCs/>
+        </w:rPr>
+      </w:pPr>
+      <w:r>
+        <w:rPr>
+          <w:b/>
+          <w:bCs/>
+        </w:rPr>
+        <w:t>A continuación, se describen las variables utilizadas en el dataset:</w:t>
+      </w:r>
+    </w:p>
+    <w:p>
+      <w:pPr>
+        <w:numPr>
+          <w:ilvl w:val="0"/>
+          <w:numId w:val="1"/>
+        </w:numPr>
+        <w:rPr>
+          <w:b/>
+          <w:bCs/>
+        </w:rPr>
+      </w:pPr>
+      <w:r>
+        <w:rPr>
+          <w:b/>
+          <w:bCs/>
+        </w:rPr>
+        <w:t>ID</w:t>
+      </w:r>
+      <w:r>
+        <w:rPr>
+          <w:b/>
+          <w:bCs/>
+        </w:rPr>
+        <w:br/>
+        <w:t xml:space="preserve">Identificador único de cada registro. </w:t>
+      </w:r>
+    </w:p>
+    <w:p>
+      <w:pPr>
+        <w:numPr>
+          <w:ilvl w:val="0"/>
+          <w:numId w:val="1"/>
+        </w:numPr>
+        <w:rPr>
+          <w:b/>
+          <w:bCs/>
+        </w:rPr>
+      </w:pPr>
+      <w:r>
+        <w:rPr>
+          <w:b/>
+          <w:bCs/>
+        </w:rPr>
+        <w:t>Date</w:t>
+      </w:r>
+      <w:r>
+        <w:rPr>
+          <w:b/>
+          <w:bCs/>
+        </w:rPr>
+        <w:br/>
+        <w:t xml:space="preserve">Fecha en la que se realiza la observación de ventas. </w:t>
+      </w:r>
+    </w:p>
+    <w:p>
+      <w:pPr>
+        <w:numPr>
+          <w:ilvl w:val="0"/>
+          <w:numId w:val="1"/>
+        </w:numPr>
+        <w:rPr>
+          <w:b/>
+          <w:bCs/>
+        </w:rPr>
+      </w:pPr>
+      <w:r>
+        <w:rPr>
+          <w:b/>
+          <w:bCs/>
+        </w:rPr>
+        <w:t>Store_nbr</w:t>
+      </w:r>
+      <w:r>
+        <w:rPr>
+          <w:b/>
+          <w:bCs/>
+        </w:rPr>
+        <w:br/>
+        <w:t xml:space="preserve">Identificador único de la tienda. </w:t>
+      </w:r>
+    </w:p>
+    <w:p>
+      <w:pPr>
+        <w:numPr>
+          <w:ilvl w:val="0"/>
+          <w:numId w:val="1"/>
+        </w:numPr>
+        <w:rPr>
+          <w:b/>
+          <w:bCs/>
+        </w:rPr>
+      </w:pPr>
+      <w:r>
+        <w:rPr>
+          <w:b/>
+          <w:bCs/>
+        </w:rPr>
+        <w:t>Family</w:t>
+      </w:r>
+      <w:r>
+        <w:rPr>
+          <w:b/>
+          <w:bCs/>
+        </w:rPr>
+        <w:br/>
+        <w:t xml:space="preserve">Tipo o familia de producto (por ejemplo: lácteos, bebidas, snacks, etc.). </w:t>
+      </w:r>
+    </w:p>
+    <w:p>
+      <w:pPr>
+        <w:numPr>
+          <w:ilvl w:val="0"/>
+          <w:numId w:val="1"/>
+        </w:numPr>
+        <w:rPr>
+          <w:b/>
+          <w:bCs/>
+        </w:rPr>
+      </w:pPr>
+      <w:r>
+        <w:rPr>
+          <w:b/>
+          <w:bCs/>
+        </w:rPr>
+        <w:t>Sales</w:t>
+      </w:r>
+      <w:r>
+        <w:rPr>
+          <w:b/>
+          <w:bCs/>
+        </w:rPr>
+        <w:br/>
+        <w:t>Cantidad total de ventas de una familia de productos en una tienda específica y en una fecha determinada.</w:t>
+      </w:r>
+      <w:r>
+        <w:rPr>
+          <w:b/>
+          <w:bCs/>
+        </w:rPr>
+        <w:br/>
+        <w:t xml:space="preserve">Puede tomar valores decimales, ya que algunos productos se venden en unidades fraccionadas (por ejemplo, 1.5 kg de queso). </w:t>
+      </w:r>
+    </w:p>
+    <w:p>
+      <w:pPr>
+        <w:numPr>
+          <w:ilvl w:val="0"/>
+          <w:numId w:val="1"/>
+        </w:numPr>
+        <w:rPr>
+          <w:b/>
+          <w:bCs/>
+        </w:rPr>
+      </w:pPr>
+      <w:r>
+        <w:rPr>
+          <w:b/>
+          <w:bCs/>
+        </w:rPr>
+        <w:t>Onpromotion</w:t>
+      </w:r>
+      <w:r>
+        <w:rPr>
+          <w:b/>
+          <w:bCs/>
+        </w:rPr>
+        <w:br/>
+        <w:t>Número de productos dentro de una familia que estaban en promoción en una tienda y fecha específicas.</w:t>
+      </w:r>
+      <w:r>
+        <w:rPr>
+          <w:b/>
+          <w:bCs/>
+        </w:rPr>
+        <w:br/>
+        <w:t xml:space="preserve">Por ejemplo: el 1 de enero de 2023, en una tienda, puede haber 3 productos de la familia “lácteos” en promoción. </w:t>
+      </w:r>
+    </w:p>
+    <w:p>
+      <w:pPr>
+        <w:numPr>
+          <w:ilvl w:val="0"/>
+          <w:numId w:val="1"/>
+        </w:numPr>
+        <w:rPr>
+          <w:b/>
+          <w:bCs/>
+        </w:rPr>
+      </w:pPr>
+      <w:r>
+        <w:rPr>
+          <w:b/>
+          <w:bCs/>
+        </w:rPr>
+        <w:t>City</w:t>
+      </w:r>
+      <w:r>
+        <w:rPr>
+          <w:b/>
+          <w:bCs/>
+        </w:rPr>
+        <w:br/>
+        <w:t xml:space="preserve">Ciudad donde se ubica la tienda. </w:t>
+      </w:r>
+    </w:p>
+    <w:p>
+      <w:pPr>
+        <w:numPr>
+          <w:ilvl w:val="0"/>
+          <w:numId w:val="1"/>
+        </w:numPr>
+        <w:rPr>
+          <w:b/>
+          <w:bCs/>
+        </w:rPr>
+      </w:pPr>
+      <w:r>
+        <w:rPr>
+          <w:b/>
+          <w:bCs/>
+        </w:rPr>
+        <w:t>State</w:t>
+      </w:r>
+      <w:r>
+        <w:rPr>
+          <w:b/>
+          <w:bCs/>
+        </w:rPr>
+        <w:br/>
+        <w:t>Estado o región donde se encuentra la tienda.</w:t>
+      </w:r>
+    </w:p>
+    <w:p>
+      <w:pPr>
+        <w:numPr>
+          <w:ilvl w:val="0"/>
+          <w:numId w:val="1"/>
+        </w:numPr>
+        <w:rPr>
+          <w:b/>
+          <w:bCs/>
+        </w:rPr>
+      </w:pPr>
+      <w:r>
+        <w:rPr>
+          <w:b/>
+          <w:bCs/>
+        </w:rPr>
+        <w:t xml:space="preserve">Type[tabla store]: tipo de tienda, pero no conocemos el criterio. Podría ser según el tamaño, </w:t>
+      </w:r>
+      <w:r>
+        <w:rPr>
+          <w:b/>
+          <w:bCs/>
+        </w:rPr>
+        <w:t xml:space="preserve">ventas, </w:t>
+      </w:r>
+      <w:r>
+        <w:rPr>
+          <w:b/>
+          <w:bCs/>
+        </w:rPr>
+        <w:t xml:space="preserve">ubicación, o formato de tienda. </w:t>
+      </w:r>
+    </w:p>
+    <w:p>
+      <w:pPr>
+        <w:numPr>
+          <w:ilvl w:val="0"/>
+          <w:numId w:val="1"/>
+        </w:numPr>
+        <w:rPr>
+          <w:b/>
+          <w:bCs/>
+        </w:rPr>
+      </w:pPr>
+      <w:r>
+        <w:rPr>
+          <w:b/>
+          <w:bCs/>
+        </w:rPr>
+        <w:t>Cluster: Número identificativo para agrupar tiendas similares. Ejemplo: si la tienda 1 y 2 pertenecen al clúster número 10, se entiende que son tiendas similares</w:t>
+      </w:r>
+    </w:p>
+    <w:p>
+      <w:pPr>
+        <w:numPr>
+          <w:ilvl w:val="0"/>
+          <w:numId w:val="1"/>
+        </w:numPr>
+        <w:rPr>
+          <w:b/>
+          <w:bCs/>
+        </w:rPr>
+      </w:pPr>
+      <w:r>
+        <w:rPr>
+          <w:b/>
+          <w:bCs/>
+        </w:rPr>
+        <w:lastRenderedPageBreak/>
+        <w:t>Transactions: Número de transacciones de genera una tienda en un día específico.</w:t>
+      </w:r>
+    </w:p>
+    <w:p>
+      <w:pPr>
+        <w:ind w:left="720"/>
+        <w:rPr>
+          <w:b/>
+          <w:bCs/>
+        </w:rPr>
+      </w:pPr>
+      <w:r>
+        <w:rPr>
+          <w:b/>
+          <w:bCs/>
+        </w:rPr>
+        <w:t>HOLYDAYS</w:t>
+      </w:r>
+    </w:p>
+    <w:p>
+      <w:pPr>
+        <w:numPr>
+          <w:ilvl w:val="0"/>
+          <w:numId w:val="1"/>
+        </w:numPr>
+        <w:rPr>
+          <w:b/>
+          <w:bCs/>
+        </w:rPr>
+      </w:pPr>
+      <w:r>
+        <w:rPr>
+          <w:b/>
+          <w:bCs/>
+        </w:rPr>
+        <w:t>Dcoilwtico: Precio de la gasolina en un día específico.</w:t>
+      </w:r>
+    </w:p>
+    <w:p>
+      <w:pPr>
+        <w:numPr>
+          <w:ilvl w:val="0"/>
+          <w:numId w:val="1"/>
+        </w:numPr>
+        <w:rPr>
+          <w:b/>
+          <w:bCs/>
+        </w:rPr>
+      </w:pPr>
+      <w:r>
+        <w:rPr>
+          <w:b/>
+          <w:bCs/>
+          <w:lang w:val="en-US"/>
+        </w:rPr>
+        <w:t>Type[holyday]: Tipo de holyday.</w:t>
+      </w:r>
+      <w:r>
+        <w:rPr>
+          <w:b/>
+          <w:bCs/>
+          <w:lang w:val="en-US"/>
+        </w:rPr>
+        <w:t xml:space="preserve"> </w:t>
+      </w:r>
+      <w:r>
+        <w:rPr>
+          <w:b/>
+          <w:bCs/>
+        </w:rPr>
+        <w:t>PD: Si es un pue</w:t>
+      </w:r>
+      <w:r>
+        <w:rPr>
+          <w:b/>
+          <w:bCs/>
+        </w:rPr>
+        <w:t>nte, serían días extra que se añaden a un festivo</w:t>
+      </w:r>
+      <w:r>
+        <w:rPr>
+          <w:b/>
+          <w:bCs/>
+        </w:rPr>
+        <w:t>, y los workdays son aquellos días donde se compensan los días no trabajados por puente.</w:t>
+      </w:r>
+    </w:p>
+    <w:p>
+      <w:pPr>
+        <w:numPr>
+          <w:ilvl w:val="0"/>
+          <w:numId w:val="1"/>
+        </w:numPr>
+        <w:rPr>
+          <w:b/>
+          <w:bCs/>
+        </w:rPr>
+      </w:pPr>
+      <w:r>
+        <w:rPr>
+          <w:b/>
+          <w:bCs/>
+        </w:rPr>
+        <w:t>Locale: Tienda local o cadena de tiendas nacional o regional</w:t>
+      </w:r>
+    </w:p>
+    <w:p>
+      <w:pPr>
+        <w:numPr>
+          <w:ilvl w:val="0"/>
+          <w:numId w:val="1"/>
+        </w:numPr>
+        <w:rPr>
+          <w:b/>
+          <w:bCs/>
+        </w:rPr>
+      </w:pPr>
+      <w:r>
+        <w:rPr>
+          <w:b/>
+          <w:bCs/>
+        </w:rPr>
+        <w:t>Locale_name: Zona, ya sea la región, el país, o la ciudad</w:t>
+      </w:r>
+    </w:p>
+    <w:p>
+      <w:pPr>
+        <w:numPr>
+          <w:ilvl w:val="0"/>
+          <w:numId w:val="1"/>
+        </w:numPr>
+        <w:rPr>
+          <w:b/>
+          <w:bCs/>
+        </w:rPr>
+      </w:pPr>
+      <w:r>
+        <w:rPr>
+          <w:b/>
+          <w:bCs/>
+        </w:rPr>
+        <w:t>Descripción: Motivo del festivo</w:t>
+      </w:r>
+    </w:p>
+    <w:p>
+      <w:pPr>
+        <w:numPr>
+          <w:ilvl w:val="0"/>
+          <w:numId w:val="1"/>
+        </w:numPr>
+        <w:rPr>
+          <w:b/>
+          <w:bCs/>
+        </w:rPr>
+      </w:pPr>
+      <w:r>
+        <w:rPr>
+          <w:b/>
+          <w:bCs/>
+        </w:rPr>
+        <w:t xml:space="preserve">Transferred: aquellos días festivos que por motivos del gobierno se han cambiado de día. </w:t>
+      </w:r>
+    </w:p>
+    <w:p>
+      <w:pPr>
+        <w:rPr>
+          <w:b/>
+          <w:bCs/>
+        </w:rPr>
+      </w:pPr>
+    </w:p>
+    <w:p>
+      <w:pPr>
+        <w:rPr>
+          <w:b/>
+          <w:bCs/>
+        </w:rPr>
+      </w:pPr>
+      <w:r>
+        <w:rPr>
+          <w:b/>
+          <w:bCs/>
+        </w:rPr>
+        <w:t>Cosas a comprobar:</w:t>
+      </w:r>
+    </w:p>
+    <w:p>
+      <w:pPr>
+        <w:pStyle w:val="Prrafodelista"/>
+        <w:numPr>
+          <w:ilvl w:val="0"/>
+          <w:numId w:val="2"/>
+        </w:numPr>
+        <w:rPr>
+          <w:b/>
+          <w:bCs/>
+        </w:rPr>
+      </w:pPr>
+      <w:r>
+        <w:rPr>
+          <w:b/>
+          <w:bCs/>
+        </w:rPr>
+        <w:t>¿Trabajan los fines de semana?</w:t>
+      </w:r>
+    </w:p>
+    <w:p>
+      <w:pPr>
+        <w:pStyle w:val="Prrafodelista"/>
+        <w:numPr>
+          <w:ilvl w:val="0"/>
+          <w:numId w:val="2"/>
+        </w:numPr>
+        <w:rPr>
+          <w:b/>
+          <w:bCs/>
+        </w:rPr>
+      </w:pPr>
+      <w:r>
+        <w:rPr>
+          <w:b/>
+          <w:bCs/>
+        </w:rPr>
+        <w:t>Crear una columna booleana donde se indique si es día de pago o no. Esta columna nos ayudara a comprobar si hay cambios de comportamiento en las ventas en los días de quincena</w:t>
+      </w:r>
+      <w:r>
+        <w:rPr>
+          <w:b/>
+          <w:bCs/>
+        </w:rPr>
+        <w:t>.</w:t>
+      </w:r>
+    </w:p>
+    <w:p>
+      <w:pPr>
+        <w:pStyle w:val="Prrafodelista"/>
+        <w:numPr>
+          <w:ilvl w:val="0"/>
+          <w:numId w:val="2"/>
+        </w:numPr>
+        <w:rPr>
+          <w:b/>
+          <w:bCs/>
+        </w:rPr>
+      </w:pPr>
+      <w:r>
+        <w:rPr>
+          <w:b/>
+          <w:bCs/>
+        </w:rPr>
+        <w:t xml:space="preserve">Creamos una columna booleana </w:t>
+      </w:r>
+      <w:r>
+        <w:rPr>
+          <w:b/>
+          <w:bCs/>
+        </w:rPr>
+        <w:t>(Crisis) donde se indique que los picos de ventas en los días posteriores al terremoto fueron causados por una crisis, de esta forma se espera que el modelo aísle estos casos atípicos a la hora de encontrar patrones y predecir.</w:t>
+      </w:r>
+    </w:p>
+    <w:p>
+      <w:pPr>
+        <w:pStyle w:val="Prrafodelista"/>
+        <w:numPr>
+          <w:ilvl w:val="0"/>
+          <w:numId w:val="2"/>
+        </w:numPr>
+        <w:rPr>
+          <w:b/>
+          <w:bCs/>
+        </w:rPr>
+      </w:pPr>
+      <w:r>
+        <w:rPr>
+          <w:b/>
+          <w:bCs/>
+        </w:rPr>
+        <w:t>Añadir columna nueva para agrupar las familias de productos.</w:t>
+      </w:r>
+    </w:p>
+    <w:p/>
+    <w:p/>
+    <w:p/>
     <w:p/>
     <w:sectPr>
       <w:pgSz w:w="11906" w:h="16838"/>
@@ -16,6 +740,279 @@
     </w:sectPr>
   </w:body>
 </w:document>
+</file>
+
+<file path=word/numbering.xml><?xml version="1.0" encoding="utf-8"?>
+<w:numbering xmlns:wpc="http://schemas.microsoft.com/office/word/2010/wordprocessingCanvas" xmlns:cx="http://schemas.microsoft.com/office/drawing/2014/chartex" xmlns:cx1="http://schemas.microsoft.com/office/drawing/2015/9/8/chartex" xmlns:cx2="http://schemas.microsoft.com/office/drawing/2015/10/21/chartex" xmlns:cx3="http://schemas.microsoft.com/office/drawing/2016/5/9/chartex" xmlns:cx4="http://schemas.microsoft.com/office/drawing/2016/5/10/chartex" xmlns:cx5="http://schemas.microsoft.com/office/drawing/2016/5/11/chartex" xmlns:cx6="http://schemas.microsoft.com/office/drawing/2016/5/12/chartex" xmlns:cx7="http://schemas.microsoft.com/office/drawing/2016/5/13/chartex" xmlns:cx8="http://schemas.microsoft.com/office/drawing/2016/5/14/chartex" xmlns:mc="http://schemas.openxmlformats.org/markup-compatibility/2006" xmlns:aink="http://schemas.microsoft.com/office/drawing/2016/ink" xmlns:am3d="http://schemas.microsoft.com/office/drawing/2017/model3d" xmlns:o="urn:schemas-microsoft-com:office:office" xmlns:oel="http://schemas.microsoft.com/office/2019/extlst" xmlns:r="http://schemas.openxmlformats.org/officeDocument/2006/relationships" xmlns:m="http://schemas.openxmlformats.org/officeDocument/2006/math" xmlns:v="urn:schemas-microsoft-com:vml" xmlns:wp14="http://schemas.microsoft.com/office/word/2010/wordprocessingDrawing" xmlns:wp="http://schemas.openxmlformats.org/drawingml/2006/wordprocessingDrawing" xmlns:w10="urn:schemas-microsoft-com:office:word" xmlns:w="http://schemas.openxmlformats.org/wordprocessingml/2006/main" xmlns:w14="http://schemas.microsoft.com/office/word/2010/wordml" xmlns:w15="http://schemas.microsoft.com/office/word/2012/wordml" xmlns:w16cex="http://schemas.microsoft.com/office/word/2018/wordml/cex" xmlns:w16cid="http://schemas.microsoft.com/office/word/2016/wordml/cid" xmlns:w16="http://schemas.microsoft.com/office/word/2018/wordml" xmlns:w16du="http://schemas.microsoft.com/office/word/2023/wordml/word16du" xmlns:w16sdtdh="http://schemas.microsoft.com/office/word/2020/wordml/sdtdatahash" xmlns:w16sdtfl="http://schemas.microsoft.com/office/word/2024/wordml/sdtformatlock" xmlns:w16se="http://schemas.microsoft.com/office/word/2015/wordml/symex" xmlns:wpg="http://schemas.microsoft.com/office/word/2010/wordprocessingGroup" xmlns:wpi="http://schemas.microsoft.com/office/word/2010/wordprocessingInk" xmlns:wne="http://schemas.microsoft.com/office/word/2006/wordml" xmlns:wps="http://schemas.microsoft.com/office/word/2010/wordprocessingShape" mc:Ignorable="w14 w15 w16se w16cid w16 w16cex w16sdtdh w16sdtfl w16du wp14">
+  <w:abstractNum w:abstractNumId="0" w15:restartNumberingAfterBreak="0">
+    <w:nsid w:val="20521B10"/>
+    <w:multiLevelType w:val="multilevel"/>
+    <w:tmpl w:val="C254B1CA"/>
+    <w:lvl w:ilvl="0">
+      <w:start w:val="1"/>
+      <w:numFmt w:val="bullet"/>
+      <w:lvlText w:val=""/>
+      <w:lvlJc w:val="left"/>
+      <w:pPr>
+        <w:tabs>
+          <w:tab w:val="num" w:pos="720"/>
+        </w:tabs>
+        <w:ind w:left="720" w:hanging="360"/>
+      </w:pPr>
+      <w:rPr>
+        <w:rFonts w:ascii="Symbol" w:hAnsi="Symbol" w:hint="default"/>
+        <w:sz w:val="20"/>
+      </w:rPr>
+    </w:lvl>
+    <w:lvl w:ilvl="1" w:tentative="1">
+      <w:start w:val="1"/>
+      <w:numFmt w:val="bullet"/>
+      <w:lvlText w:val="o"/>
+      <w:lvlJc w:val="left"/>
+      <w:pPr>
+        <w:tabs>
+          <w:tab w:val="num" w:pos="1440"/>
+        </w:tabs>
+        <w:ind w:left="1440" w:hanging="360"/>
+      </w:pPr>
+      <w:rPr>
+        <w:rFonts w:ascii="Courier New" w:hAnsi="Courier New" w:hint="default"/>
+        <w:sz w:val="20"/>
+      </w:rPr>
+    </w:lvl>
+    <w:lvl w:ilvl="2" w:tentative="1">
+      <w:start w:val="1"/>
+      <w:numFmt w:val="bullet"/>
+      <w:lvlText w:val=""/>
+      <w:lvlJc w:val="left"/>
+      <w:pPr>
+        <w:tabs>
+          <w:tab w:val="num" w:pos="2160"/>
+        </w:tabs>
+        <w:ind w:left="2160" w:hanging="360"/>
+      </w:pPr>
+      <w:rPr>
+        <w:rFonts w:ascii="Wingdings" w:hAnsi="Wingdings" w:hint="default"/>
+        <w:sz w:val="20"/>
+      </w:rPr>
+    </w:lvl>
+    <w:lvl w:ilvl="3" w:tentative="1">
+      <w:start w:val="1"/>
+      <w:numFmt w:val="bullet"/>
+      <w:lvlText w:val=""/>
+      <w:lvlJc w:val="left"/>
+      <w:pPr>
+        <w:tabs>
+          <w:tab w:val="num" w:pos="2880"/>
+        </w:tabs>
+        <w:ind w:left="2880" w:hanging="360"/>
+      </w:pPr>
+      <w:rPr>
+        <w:rFonts w:ascii="Wingdings" w:hAnsi="Wingdings" w:hint="default"/>
+        <w:sz w:val="20"/>
+      </w:rPr>
+    </w:lvl>
+    <w:lvl w:ilvl="4" w:tentative="1">
+      <w:start w:val="1"/>
+      <w:numFmt w:val="bullet"/>
+      <w:lvlText w:val=""/>
+      <w:lvlJc w:val="left"/>
+      <w:pPr>
+        <w:tabs>
+          <w:tab w:val="num" w:pos="3600"/>
+        </w:tabs>
+        <w:ind w:left="3600" w:hanging="360"/>
+      </w:pPr>
+      <w:rPr>
+        <w:rFonts w:ascii="Wingdings" w:hAnsi="Wingdings" w:hint="default"/>
+        <w:sz w:val="20"/>
+      </w:rPr>
+    </w:lvl>
+    <w:lvl w:ilvl="5" w:tentative="1">
+      <w:start w:val="1"/>
+      <w:numFmt w:val="bullet"/>
+      <w:lvlText w:val=""/>
+      <w:lvlJc w:val="left"/>
+      <w:pPr>
+        <w:tabs>
+          <w:tab w:val="num" w:pos="4320"/>
+        </w:tabs>
+        <w:ind w:left="4320" w:hanging="360"/>
+      </w:pPr>
+      <w:rPr>
+        <w:rFonts w:ascii="Wingdings" w:hAnsi="Wingdings" w:hint="default"/>
+        <w:sz w:val="20"/>
+      </w:rPr>
+    </w:lvl>
+    <w:lvl w:ilvl="6" w:tentative="1">
+      <w:start w:val="1"/>
+      <w:numFmt w:val="bullet"/>
+      <w:lvlText w:val=""/>
+      <w:lvlJc w:val="left"/>
+      <w:pPr>
+        <w:tabs>
+          <w:tab w:val="num" w:pos="5040"/>
+        </w:tabs>
+        <w:ind w:left="5040" w:hanging="360"/>
+      </w:pPr>
+      <w:rPr>
+        <w:rFonts w:ascii="Wingdings" w:hAnsi="Wingdings" w:hint="default"/>
+        <w:sz w:val="20"/>
+      </w:rPr>
+    </w:lvl>
+    <w:lvl w:ilvl="7" w:tentative="1">
+      <w:start w:val="1"/>
+      <w:numFmt w:val="bullet"/>
+      <w:lvlText w:val=""/>
+      <w:lvlJc w:val="left"/>
+      <w:pPr>
+        <w:tabs>
+          <w:tab w:val="num" w:pos="5760"/>
+        </w:tabs>
+        <w:ind w:left="5760" w:hanging="360"/>
+      </w:pPr>
+      <w:rPr>
+        <w:rFonts w:ascii="Wingdings" w:hAnsi="Wingdings" w:hint="default"/>
+        <w:sz w:val="20"/>
+      </w:rPr>
+    </w:lvl>
+    <w:lvl w:ilvl="8" w:tentative="1">
+      <w:start w:val="1"/>
+      <w:numFmt w:val="bullet"/>
+      <w:lvlText w:val=""/>
+      <w:lvlJc w:val="left"/>
+      <w:pPr>
+        <w:tabs>
+          <w:tab w:val="num" w:pos="6480"/>
+        </w:tabs>
+        <w:ind w:left="6480" w:hanging="360"/>
+      </w:pPr>
+      <w:rPr>
+        <w:rFonts w:ascii="Wingdings" w:hAnsi="Wingdings" w:hint="default"/>
+        <w:sz w:val="20"/>
+      </w:rPr>
+    </w:lvl>
+  </w:abstractNum>
+  <w:abstractNum w:abstractNumId="1" w15:restartNumberingAfterBreak="0">
+    <w:nsid w:val="777763D6"/>
+    <w:multiLevelType w:val="hybridMultilevel"/>
+    <w:tmpl w:val="8752CA46"/>
+    <w:lvl w:ilvl="0" w:tplc="0C0A0001">
+      <w:start w:val="1"/>
+      <w:numFmt w:val="bullet"/>
+      <w:lvlText w:val=""/>
+      <w:lvlJc w:val="left"/>
+      <w:pPr>
+        <w:ind w:left="720" w:hanging="360"/>
+      </w:pPr>
+      <w:rPr>
+        <w:rFonts w:ascii="Symbol" w:hAnsi="Symbol" w:hint="default"/>
+      </w:rPr>
+    </w:lvl>
+    <w:lvl w:ilvl="1" w:tplc="0C0A0003">
+      <w:start w:val="1"/>
+      <w:numFmt w:val="bullet"/>
+      <w:lvlText w:val="o"/>
+      <w:lvlJc w:val="left"/>
+      <w:pPr>
+        <w:ind w:left="1440" w:hanging="360"/>
+      </w:pPr>
+      <w:rPr>
+        <w:rFonts w:ascii="Courier New" w:hAnsi="Courier New" w:cs="Courier New" w:hint="default"/>
+      </w:rPr>
+    </w:lvl>
+    <w:lvl w:ilvl="2" w:tplc="0C0A0005" w:tentative="1">
+      <w:start w:val="1"/>
+      <w:numFmt w:val="bullet"/>
+      <w:lvlText w:val=""/>
+      <w:lvlJc w:val="left"/>
+      <w:pPr>
+        <w:ind w:left="2160" w:hanging="360"/>
+      </w:pPr>
+      <w:rPr>
+        <w:rFonts w:ascii="Wingdings" w:hAnsi="Wingdings" w:hint="default"/>
+      </w:rPr>
+    </w:lvl>
+    <w:lvl w:ilvl="3" w:tplc="0C0A0001" w:tentative="1">
+      <w:start w:val="1"/>
+      <w:numFmt w:val="bullet"/>
+      <w:lvlText w:val=""/>
+      <w:lvlJc w:val="left"/>
+      <w:pPr>
+        <w:ind w:left="2880" w:hanging="360"/>
+      </w:pPr>
+      <w:rPr>
+        <w:rFonts w:ascii="Symbol" w:hAnsi="Symbol" w:hint="default"/>
+      </w:rPr>
+    </w:lvl>
+    <w:lvl w:ilvl="4" w:tplc="0C0A0003" w:tentative="1">
+      <w:start w:val="1"/>
+      <w:numFmt w:val="bullet"/>
+      <w:lvlText w:val="o"/>
+      <w:lvlJc w:val="left"/>
+      <w:pPr>
+        <w:ind w:left="3600" w:hanging="360"/>
+      </w:pPr>
+      <w:rPr>
+        <w:rFonts w:ascii="Courier New" w:hAnsi="Courier New" w:cs="Courier New" w:hint="default"/>
+      </w:rPr>
+    </w:lvl>
+    <w:lvl w:ilvl="5" w:tplc="0C0A0005" w:tentative="1">
+      <w:start w:val="1"/>
+      <w:numFmt w:val="bullet"/>
+      <w:lvlText w:val=""/>
+      <w:lvlJc w:val="left"/>
+      <w:pPr>
+        <w:ind w:left="4320" w:hanging="360"/>
+      </w:pPr>
+      <w:rPr>
+        <w:rFonts w:ascii="Wingdings" w:hAnsi="Wingdings" w:hint="default"/>
+      </w:rPr>
+    </w:lvl>
+    <w:lvl w:ilvl="6" w:tplc="0C0A0001" w:tentative="1">
+      <w:start w:val="1"/>
+      <w:numFmt w:val="bullet"/>
+      <w:lvlText w:val=""/>
+      <w:lvlJc w:val="left"/>
+      <w:pPr>
+        <w:ind w:left="5040" w:hanging="360"/>
+      </w:pPr>
+      <w:rPr>
+        <w:rFonts w:ascii="Symbol" w:hAnsi="Symbol" w:hint="default"/>
+      </w:rPr>
+    </w:lvl>
+    <w:lvl w:ilvl="7" w:tplc="0C0A0003" w:tentative="1">
+      <w:start w:val="1"/>
+      <w:numFmt w:val="bullet"/>
+      <w:lvlText w:val="o"/>
+      <w:lvlJc w:val="left"/>
+      <w:pPr>
+        <w:ind w:left="5760" w:hanging="360"/>
+      </w:pPr>
+      <w:rPr>
+        <w:rFonts w:ascii="Courier New" w:hAnsi="Courier New" w:cs="Courier New" w:hint="default"/>
+      </w:rPr>
+    </w:lvl>
+    <w:lvl w:ilvl="8" w:tplc="0C0A0005" w:tentative="1">
+      <w:start w:val="1"/>
+      <w:numFmt w:val="bullet"/>
+      <w:lvlText w:val=""/>
+      <w:lvlJc w:val="left"/>
+      <w:pPr>
+        <w:ind w:left="6480" w:hanging="360"/>
+      </w:pPr>
+      <w:rPr>
+        <w:rFonts w:ascii="Wingdings" w:hAnsi="Wingdings" w:hint="default"/>
+      </w:rPr>
+    </w:lvl>
+  </w:abstractNum>
+  <w:num w:numId="1" w16cid:durableId="270287130">
+    <w:abstractNumId w:val="0"/>
+  </w:num>
+  <w:num w:numId="2" w16cid:durableId="713621903">
+    <w:abstractNumId w:val="1"/>
+  </w:num>
+</w:numbering>
 </file>
 
 <file path=word/styles.xml><?xml version="1.0" encoding="utf-8"?>
@@ -621,7 +1618,6 @@
   <w:style w:type="character" w:default="1" w:styleId="Fuentedeprrafopredeter">
     <w:name w:val="Default Paragraph Font"/>
     <w:uiPriority w:val="1"/>
-    <w:semiHidden/>
     <w:unhideWhenUsed/>
   </w:style>
   <w:style w:type="table" w:default="1" w:styleId="Tablanormal">

</xml_diff>